<commit_message>
chore(reviewer-docs): regenerate vocab sample docx with batch I placeholders
</commit_message>
<xml_diff>
--- a/N5/docs/vocab-review/N5-vocab-review-SAMPLE-私.docx
+++ b/N5/docs/vocab-review/N5-vocab-review-SAMPLE-私.docx
@@ -29,7 +29,7 @@
           <w:color w:val="666666"/>
           <w:sz w:val="20"/>
         </w:rPr>
-        <w:t>1 entries  ·  built 2026-06-04  ·  JLPTSuccess release v1.17.37</w:t>
+        <w:t>1 entries  ·  built 2026-06-04  ·  JLPTSuccess release v1.17.38</w:t>
       </w:r>
     </w:p>
     <w:p>
@@ -1422,6 +1422,70 @@
           <w:color w:val="14452A"/>
           <w:sz w:val="26"/>
         </w:rPr>
+        <w:t>Multiple uses (pragmatic)</w:t>
+      </w:r>
+      <w:r>
+        <w:rPr>
+          <w:rFonts w:ascii="Calibri" w:hAnsi="Calibri" w:eastAsia="Yu Gothic"/>
+          <w:b w:val="0"/>
+          <w:i w:val="0"/>
+          <w:color w:val="666666"/>
+          <w:sz w:val="20"/>
+        </w:rPr>
+        <w:t xml:space="preserve">  用法</w:t>
+      </w:r>
+    </w:p>
+    <w:p>
+      <w:pPr>
+        <w:spacing w:before="40" w:after="40"/>
+      </w:pPr>
+      <w:r>
+        <w:rPr>
+          <w:rFonts w:ascii="Calibri" w:hAnsi="Calibri" w:eastAsia="Yu Gothic"/>
+          <w:b/>
+          <w:i w:val="0"/>
+        </w:rPr>
+        <w:t>'I' — often OMITTED in Japanese when context is clear</w:t>
+      </w:r>
+      <w:r>
+        <w:rPr>
+          <w:rFonts w:ascii="Calibri" w:hAnsi="Calibri" w:eastAsia="Yu Gothic"/>
+          <w:b w:val="0"/>
+          <w:i w:val="0"/>
+        </w:rPr>
+        <w:t xml:space="preserve">  —  私 means 'I' / 'me', but native Japanese speakers usually OMIT the subject when it's already clear from context. Saying 私 explicitly in every sentence sounds heavy or English-influenced.</w:t>
+      </w:r>
+    </w:p>
+    <w:p>
+      <w:pPr>
+        <w:spacing w:before="0" w:after="40"/>
+      </w:pPr>
+      <w:r>
+        <w:rPr>
+          <w:rFonts w:ascii="Calibri" w:hAnsi="Calibri" w:eastAsia="Yu Gothic"/>
+          <w:b w:val="0"/>
+          <w:i w:val="0"/>
+          <w:color w:val="666666"/>
+          <w:sz w:val="20"/>
+        </w:rPr>
+        <w:t>Examples: 「日本語を勉強します」 (subject omitted, understood as 'I') is more natural than 「私は日本語を勉強します」 in everyday speech. Use 私 when contrasting ('わたしは行きません、あなたは…') or first introducing yourself. Reading 'わたくし' is the formal version; 'わたし' is everyday-polite.</w:t>
+      </w:r>
+    </w:p>
+    <w:p>
+      <w:pPr>
+        <w:spacing w:before="200" w:after="60"/>
+        <w:pBdr>
+          <w:bottom w:val="single" w:sz="4" w:space="1" w:color="CCCCCC"/>
+        </w:pBdr>
+      </w:pPr>
+      <w:r>
+        <w:rPr>
+          <w:rFonts w:ascii="Calibri" w:hAnsi="Calibri" w:eastAsia="Yu Gothic"/>
+          <w:b/>
+          <w:i w:val="0"/>
+          <w:color w:val="14452A"/>
+          <w:sz w:val="26"/>
+        </w:rPr>
         <w:t>Provenance &amp; review status</w:t>
       </w:r>
       <w:r>
@@ -1529,13 +1593,33 @@
           </w:tcPr>
           <w:p>
             <w:pPr>
-              <w:spacing w:after="120"/>
+              <w:spacing w:after="40"/>
             </w:pPr>
+            <w:r>
+              <w:rPr>
+                <w:rFonts w:ascii="Calibri" w:hAnsi="Calibri" w:eastAsia="Yu Gothic"/>
+                <w:b w:val="0"/>
+                <w:i/>
+                <w:color w:val="B31B1B"/>
+                <w:sz w:val="20"/>
+              </w:rPr>
+              <w:t>☐ 未確認 / not yet reviewed</w:t>
+            </w:r>
           </w:p>
           <w:p>
             <w:pPr>
               <w:spacing w:after="120"/>
             </w:pPr>
+            <w:r>
+              <w:rPr>
+                <w:rFonts w:ascii="Calibri" w:hAnsi="Calibri" w:eastAsia="Yu Gothic"/>
+                <w:b w:val="0"/>
+                <w:i/>
+                <w:color w:val="666666"/>
+                <w:sz w:val="18"/>
+              </w:rPr>
+              <w:t>[Native reviewer: delete the line above and write 「問題なし。」 if the entry is correct, OR 「要修正: &lt;issue&gt;」 with a specific issue. Empty boxes are treated as 'not yet reviewed'.]</w:t>
+            </w:r>
           </w:p>
           <w:p>
             <w:pPr>

</xml_diff>

<commit_message>
docs(vocab-review): remove 6 metadata lines from the reviewer Word document
Per user request, removed these lines from every vocabulary entry in the
reviewer Word document:
  - Pitch accent
  - Register
  - Register origin
  - Part of speech
  - Frequency rank
  - Frequent patterns

Kept everything else (reading, counter, verb class, transitivity, example
sentences, etc.). Also trimmed the document's intro so it no longer tells the
reviewer to check the removed fields.

Only the document generator + the regenerated Word files change. The underlying
vocabulary data is untouched, so nothing else is affected. Verified the six
lines are absent from both a one-word sample and the full 995-entry document.

Co-Authored-By: Claude Opus 4.8 <noreply@anthropic.com>
</commit_message>
<xml_diff>
--- a/N5/docs/vocab-review/N5-vocab-review-SAMPLE-私.docx
+++ b/N5/docs/vocab-review/N5-vocab-review-SAMPLE-私.docx
@@ -29,7 +29,7 @@
           <w:color w:val="666666"/>
           <w:sz w:val="20"/>
         </w:rPr>
-        <w:t>1 entries  ·  built 2026-06-04  ·  JLPTSuccess release v1.17.38</w:t>
+        <w:t>1 entries  ·  built 2026-06-06  ·  JLPTSuccess release v1.17.40</w:t>
       </w:r>
     </w:p>
     <w:p>
@@ -385,27 +385,6 @@
           <w:b/>
           <w:i w:val="0"/>
         </w:rPr>
-        <w:t xml:space="preserve">• Pitch accent: </w:t>
-      </w:r>
-      <w:r>
-        <w:rPr>
-          <w:rFonts w:ascii="Calibri" w:hAnsi="Calibri" w:eastAsia="Yu Gothic"/>
-          <w:b w:val="0"/>
-          <w:i w:val="0"/>
-        </w:rPr>
-        <w:t>HL contour (Tokyo dialect). Drop position correct? Heiban vs kifuku flagged correctly?</w:t>
-      </w:r>
-    </w:p>
-    <w:p>
-      <w:pPr>
-        <w:spacing w:before="40" w:after="40"/>
-      </w:pPr>
-      <w:r>
-        <w:rPr>
-          <w:rFonts w:ascii="Calibri" w:hAnsi="Calibri" w:eastAsia="Yu Gothic"/>
-          <w:b/>
-          <w:i w:val="0"/>
-        </w:rPr>
         <w:t xml:space="preserve">• Counter (if shown): </w:t>
       </w:r>
       <w:r>
@@ -427,7 +406,7 @@
           <w:b/>
           <w:i w:val="0"/>
         </w:rPr>
-        <w:t xml:space="preserve">• Register: </w:t>
+        <w:t xml:space="preserve">• Verb class (for verbs): </w:t>
       </w:r>
       <w:r>
         <w:rPr>
@@ -435,28 +414,7 @@
           <w:b w:val="0"/>
           <w:i w:val="0"/>
         </w:rPr>
-        <w:t>neutral / casual / polite / humble / respectful — accurate? And does the entry feel like N5-appropriate vocabulary at that register?</w:t>
-      </w:r>
-    </w:p>
-    <w:p>
-      <w:pPr>
-        <w:spacing w:before="40" w:after="40"/>
-      </w:pPr>
-      <w:r>
-        <w:rPr>
-          <w:rFonts w:ascii="Calibri" w:hAnsi="Calibri" w:eastAsia="Yu Gothic"/>
-          <w:b/>
-          <w:i w:val="0"/>
-        </w:rPr>
-        <w:t xml:space="preserve">• Part of speech / Verb class: </w:t>
-      </w:r>
-      <w:r>
-        <w:rPr>
-          <w:rFonts w:ascii="Calibri" w:hAnsi="Calibri" w:eastAsia="Yu Gothic"/>
-          <w:b w:val="0"/>
-          <w:i w:val="0"/>
-        </w:rPr>
-        <w:t>Noun / verb / adjective / particle classification. For verbs: Group 1 (う-verb) / Group 2 (る-verb) / Irregular — correct? Group-1 exception flag accurate?</w:t>
+        <w:t>Group 1 (う-verb) / Group 2 (る-verb) / Irregular — correct? Group-1 exception flag accurate?</w:t>
       </w:r>
     </w:p>
     <w:p>
@@ -715,7 +673,7 @@
           <w:b w:val="0"/>
           <w:i w:val="0"/>
         </w:rPr>
-        <w:t>Structured detail: English, Hindi gloss (when present), reading, pitch-accent HL contour, counter, register, register origin, POS / verb-class, frequency rank, and patterns that frequently co-occur with this word.</w:t>
+        <w:t>Structured detail: English, Hindi gloss (when present), reading, counter, and verb-class (for verbs).</w:t>
       </w:r>
     </w:p>
     <w:p>
@@ -1030,37 +988,6 @@
           <w:b/>
           <w:i w:val="0"/>
         </w:rPr>
-        <w:t xml:space="preserve">Pitch accent: </w:t>
-      </w:r>
-      <w:r>
-        <w:rPr>
-          <w:rFonts w:ascii="Calibri" w:hAnsi="Calibri" w:eastAsia="Yu Gothic"/>
-          <w:b w:val="0"/>
-          <w:i w:val="0"/>
-        </w:rPr>
-        <w:t>Lわ Hた Hし (heiban)</w:t>
-      </w:r>
-      <w:r>
-        <w:rPr>
-          <w:rFonts w:ascii="Calibri" w:hAnsi="Calibri" w:eastAsia="Yu Gothic"/>
-          <w:b w:val="0"/>
-          <w:i w:val="0"/>
-          <w:color w:val="666666"/>
-          <w:sz w:val="18"/>
-        </w:rPr>
-        <w:t xml:space="preserve">  [confidence: high]</w:t>
-      </w:r>
-    </w:p>
-    <w:p>
-      <w:pPr>
-        <w:spacing w:before="40" w:after="40"/>
-      </w:pPr>
-      <w:r>
-        <w:rPr>
-          <w:rFonts w:ascii="Calibri" w:hAnsi="Calibri" w:eastAsia="Yu Gothic"/>
-          <w:b/>
-          <w:i w:val="0"/>
-        </w:rPr>
         <w:t xml:space="preserve">Counter: </w:t>
       </w:r>
       <w:r>
@@ -1070,111 +997,6 @@
           <w:i w:val="0"/>
         </w:rPr>
         <w:t>〜にん</w:t>
-      </w:r>
-    </w:p>
-    <w:p>
-      <w:pPr>
-        <w:spacing w:before="40" w:after="40"/>
-      </w:pPr>
-      <w:r>
-        <w:rPr>
-          <w:rFonts w:ascii="Calibri" w:hAnsi="Calibri" w:eastAsia="Yu Gothic"/>
-          <w:b/>
-          <w:i w:val="0"/>
-        </w:rPr>
-        <w:t xml:space="preserve">Register: </w:t>
-      </w:r>
-      <w:r>
-        <w:rPr>
-          <w:rFonts w:ascii="Calibri" w:hAnsi="Calibri" w:eastAsia="Yu Gothic"/>
-          <w:b w:val="0"/>
-          <w:i w:val="0"/>
-        </w:rPr>
-        <w:t>neutral</w:t>
-      </w:r>
-    </w:p>
-    <w:p>
-      <w:pPr>
-        <w:spacing w:before="40" w:after="40"/>
-      </w:pPr>
-      <w:r>
-        <w:rPr>
-          <w:rFonts w:ascii="Calibri" w:hAnsi="Calibri" w:eastAsia="Yu Gothic"/>
-          <w:b/>
-          <w:i w:val="0"/>
-        </w:rPr>
-        <w:t xml:space="preserve">Register origin: </w:t>
-      </w:r>
-      <w:r>
-        <w:rPr>
-          <w:rFonts w:ascii="Calibri" w:hAnsi="Calibri" w:eastAsia="Yu Gothic"/>
-          <w:b w:val="0"/>
-          <w:i w:val="0"/>
-        </w:rPr>
-        <w:t>wago</w:t>
-      </w:r>
-    </w:p>
-    <w:p>
-      <w:pPr>
-        <w:spacing w:before="40" w:after="40"/>
-      </w:pPr>
-      <w:r>
-        <w:rPr>
-          <w:rFonts w:ascii="Calibri" w:hAnsi="Calibri" w:eastAsia="Yu Gothic"/>
-          <w:b/>
-          <w:i w:val="0"/>
-        </w:rPr>
-        <w:t xml:space="preserve">Part of speech: </w:t>
-      </w:r>
-      <w:r>
-        <w:rPr>
-          <w:rFonts w:ascii="Calibri" w:hAnsi="Calibri" w:eastAsia="Yu Gothic"/>
-          <w:b w:val="0"/>
-          <w:i w:val="0"/>
-        </w:rPr>
-        <w:t>pronoun</w:t>
-      </w:r>
-    </w:p>
-    <w:p>
-      <w:pPr>
-        <w:spacing w:before="40" w:after="40"/>
-      </w:pPr>
-      <w:r>
-        <w:rPr>
-          <w:rFonts w:ascii="Calibri" w:hAnsi="Calibri" w:eastAsia="Yu Gothic"/>
-          <w:b/>
-          <w:i w:val="0"/>
-        </w:rPr>
-        <w:t xml:space="preserve">Frequency rank: </w:t>
-      </w:r>
-      <w:r>
-        <w:rPr>
-          <w:rFonts w:ascii="Calibri" w:hAnsi="Calibri" w:eastAsia="Yu Gothic"/>
-          <w:b w:val="0"/>
-          <w:i w:val="0"/>
-        </w:rPr>
-        <w:t>38 (source: leeds_corpus_internet_jp)</w:t>
-      </w:r>
-    </w:p>
-    <w:p>
-      <w:pPr>
-        <w:spacing w:before="40" w:after="40"/>
-      </w:pPr>
-      <w:r>
-        <w:rPr>
-          <w:rFonts w:ascii="Calibri" w:hAnsi="Calibri" w:eastAsia="Yu Gothic"/>
-          <w:b/>
-          <w:i w:val="0"/>
-        </w:rPr>
-        <w:t xml:space="preserve">Frequent patterns: </w:t>
-      </w:r>
-      <w:r>
-        <w:rPr>
-          <w:rFonts w:ascii="Calibri" w:hAnsi="Calibri" w:eastAsia="Yu Gothic"/>
-          <w:b w:val="0"/>
-          <w:i w:val="0"/>
-        </w:rPr>
-        <w:t>n5-001, n5-002</w:t>
       </w:r>
     </w:p>
     <w:p>

</xml_diff>